<commit_message>
regenerate paper 01's elsevier pdf and word files after the highlight and short-title edits
</commit_message>
<xml_diff>
--- a/papers/01-evidence-audit/from-synchronization-physics-to-trained-dynamics-highlights.docx
+++ b/papers/01-evidence-audit/from-synchronization-physics-to-trained-dynamics-highlights.docx
@@ -52,7 +52,7 @@
         </w:numPr>
       </w:pPr>
       <w:r>
-        <w:t xml:space="preserve">Sixteen of sixty-five control comparisons run; the coupling term ablated three times</w:t>
+        <w:t xml:space="preserve">Historical survey of oscillatory dynamics: physics, neuroscience, machine learning</w:t>
       </w:r>
     </w:p>
     <w:p>
@@ -76,7 +76,7 @@
         </w:numPr>
       </w:pPr>
       <w:r>
-        <w:t xml:space="preserve">Eight research directions, a shared benchmark, a control standard, new coupling laws</w:t>
+        <w:t xml:space="preserve">Eight research directions: common datasets, methods, controls and coupling laws</w:t>
       </w:r>
     </w:p>
     <w:bookmarkEnd w:id="9"/>
@@ -937,7 +937,7 @@
     <w:name w:val="Hyperlink"/>
     <w:basedOn w:val="BodyTextChar"/>
     <w:rPr>
-      <w:color w:themeColor="accent1" w:val="4F81BD"/>
+      <w:color w:val="0645AD"/>
     </w:rPr>
   </w:style>
   <w:style w:styleId="TOCHeading" w:type="paragraph">

</xml_diff>